<commit_message>
commit till chapter 5
</commit_message>
<xml_diff>
--- a/docs/chapter_02_recording_outputs/AgentDesk_Chapter_02_ElevenLabs_Plain_Script.docx
+++ b/docs/chapter_02_recording_outputs/AgentDesk_Chapter_02_ElevenLabs_Plain_Script.docx
@@ -1,6 +1,6 @@
 
 <file path=word/document.xml><?xml version="1.0" encoding="utf-8"?>
-<w:document xmlns:w="http://schemas.openxmlformats.org/wordprocessingml/2006/main" xmlns:r="http://schemas.openxmlformats.org/officeDocument/2006/relationships">
+<w:document xmlns:w="http://schemas.openxmlformats.org/wordprocessingml/2006/main">
   <w:body>
     <w:p>
       <w:r>
@@ -134,7 +134,7 @@
     </w:p>
     <w:p>
       <w:r>
-        <w:t xml:space="preserve">The virtual environment is important because it keeps this project?s Python packages separate from other projects on the system. When we build AI projects, package versions matter. A virtual environment prevents one project from breaking another project.</w:t>
+        <w:t xml:space="preserve">The virtual environment is important because it keeps this project's Python packages separate from other projects on the system. When we build AI projects, package versions matter. A virtual environment prevents one project from breaking another project.</w:t>
       </w:r>
     </w:p>
     <w:p>
@@ -414,7 +414,7 @@
     </w:p>
     <w:sectPr>
       <w:pgSz w:w="12240" w:h="15840"/>
-      <w:pgMar w:top="1440" w:right="1440" w:bottom="1440" w:left="1440"/>
+      <w:pgMar w:top="720" w:right="720" w:bottom="720" w:left="720"/>
     </w:sectPr>
   </w:body>
 </w:document>

</xml_diff>